<commit_message>
Further simplify Lab 5 code and docx with minimal theory
</commit_message>
<xml_diff>
--- a/Lab5/OS_Lab5_2024UCP1566.docx
+++ b/Lab5/OS_Lab5_2024UCP1566.docx
@@ -11,7 +11,7 @@
         <w:rPr>
           <w:rFonts w:ascii="Calibri" w:hAnsi="Calibri"/>
           <w:b/>
-          <w:sz w:val="30"/>
+          <w:sz w:val="28"/>
         </w:rPr>
         <w:t>Operating System Lab</w:t>
         <w:br/>
@@ -35,13 +35,13 @@
     <w:p>
       <w:pPr>
         <w:keepNext/>
-        <w:spacing w:before="180" w:after="80"/>
+        <w:spacing w:before="160" w:after="80"/>
       </w:pPr>
       <w:r>
         <w:rPr>
           <w:rFonts w:ascii="Calibri" w:hAnsi="Calibri"/>
           <w:b/>
-          <w:sz w:val="27"/>
+          <w:sz w:val="26"/>
         </w:rPr>
         <w:t>Problem Statement:</w:t>
       </w:r>
@@ -53,195 +53,189 @@
       <w:r>
         <w:rPr>
           <w:rFonts w:ascii="Calibri" w:hAnsi="Calibri"/>
-          <w:sz w:val="24"/>
+          <w:sz w:val="23"/>
         </w:rPr>
-        <w:t>Write a C program that creates three processes using fork() and establishes communication between them using pipes. The processes perform the following pipeline tasks:</w:t>
+        <w:t>Write a C program using fork() and pipes for inter-process communication:</w:t>
         <w:br/>
-        <w:t>• Process 1 (File Reader): Asks user for input file path, reads contents, sends to Process 2 via Pipe 1, and displays final word count received from Process 3 via Pipe 3.</w:t>
+        <w:t>• Process 1 (File Reader): Reads an input file and sends content to Process 2.</w:t>
         <w:br/>
-        <w:t>• Process 2 (Text Formatter): Receives text via Pipe 1, collapses multiple spaces into single spaces, removes spaces preceding punctuation marks, ensures exactly one space after punctuation marks, and sends formatted text to Process 3 via Pipe 2.</w:t>
+        <w:t>• Process 2 (Formatter): Removes extra spaces, formats punctuation, and sends to Process 3.</w:t>
         <w:br/>
-        <w:t>• Process 3 (Case Converter &amp; Word Counter): Receives formatted text via Pipe 2, converts the first character of every word to uppercase and remaining characters to lowercase while preserving punctuation marks, prints the final text, counts total words, and transmits word count back to Process 1 via Pipe 3.</w:t>
+        <w:t>• Process 3 (Converter &amp; Counter): Converts text to title case, prints output, counts words, and sends count back to Process 1.</w:t>
+        <w:br/>
+        <w:t>• Process 1: Prints the final total word count.</w:t>
       </w:r>
     </w:p>
     <w:p>
       <w:pPr>
         <w:keepNext/>
-        <w:spacing w:before="140" w:after="60"/>
+        <w:spacing w:before="120" w:after="40"/>
       </w:pPr>
       <w:r>
         <w:rPr>
           <w:rFonts w:ascii="Calibri" w:hAnsi="Calibri"/>
           <w:b/>
-          <w:sz w:val="25"/>
+          <w:sz w:val="24"/>
         </w:rPr>
-        <w:t>Pipeline Communication Architecture:</w:t>
+        <w:t>Pipeline Flow:</w:t>
       </w:r>
     </w:p>
     <w:p>
       <w:pPr>
-        <w:spacing w:after="120"/>
+        <w:spacing w:after="80"/>
       </w:pPr>
       <w:r>
         <w:rPr>
           <w:rFonts w:ascii="Consolas" w:hAnsi="Consolas"/>
-          <w:sz w:val="21"/>
+          <w:sz w:val="19"/>
         </w:rPr>
-        <w:t xml:space="preserve">   Process 1 (File Reader)  ------[ Pipe 1 ]-----&gt;  Process 2 (Text Formatter)</w:t>
+        <w:t>Process 1 (File Reader) -----[ Pipe 1 ]-----&gt; Process 2 (Formatter)</w:t>
         <w:br/>
-        <w:t xml:space="preserve">              ^                                                    |</w:t>
+        <w:t xml:space="preserve">         ^                                           |</w:t>
         <w:br/>
-        <w:t xml:space="preserve">              |                                                    | [ Pipe 2 ]</w:t>
+        <w:t xml:space="preserve">         |                                           | [ Pipe 2 ]</w:t>
         <w:br/>
-        <w:t xml:space="preserve">              |                                                    v</w:t>
+        <w:t xml:space="preserve">         |                                           v</w:t>
         <w:br/>
-        <w:t xml:space="preserve">       [ Pipe 3 (Word Count) ] &lt;----------  Process 3 (Case Converter &amp; Word Counter)</w:t>
+        <w:t xml:space="preserve">  [ Pipe 3 (Count) ] &lt;----------------- Process 3 (Converter &amp; Counter)</w:t>
       </w:r>
     </w:p>
     <w:p>
       <w:pPr>
         <w:keepNext/>
-        <w:spacing w:before="140" w:after="60"/>
+        <w:spacing w:before="120" w:after="40"/>
       </w:pPr>
       <w:r>
         <w:rPr>
           <w:rFonts w:ascii="Calibri" w:hAnsi="Calibri"/>
           <w:b/>
-          <w:sz w:val="25"/>
+          <w:sz w:val="24"/>
         </w:rPr>
         <w:t>Important concepts learned:</w:t>
       </w:r>
     </w:p>
     <w:p>
       <w:pPr>
-        <w:spacing w:after="60" w:before="0"/>
+        <w:spacing w:after="40" w:before="0"/>
       </w:pPr>
       <w:r>
         <w:rPr>
           <w:rFonts w:ascii="Calibri" w:hAnsi="Calibri"/>
           <w:b/>
-          <w:sz w:val="25"/>
+          <w:sz w:val="24"/>
         </w:rPr>
-        <w:t xml:space="preserve">1) Inter-Process Communication (IPC) via Pipes: </w:t>
+        <w:t xml:space="preserve">1) </w:t>
       </w:r>
       <w:r>
         <w:rPr>
           <w:rFonts w:ascii="Calibri" w:hAnsi="Calibri"/>
-          <w:sz w:val="25"/>
+          <w:b/>
+          <w:sz w:val="24"/>
         </w:rPr>
-        <w:t>Pipes provide unidirectional FIFO byte streams using pipe(fd). Data written into fd[1] is read from fd[0].</w:t>
+        <w:t xml:space="preserve">pipe(): </w:t>
+      </w:r>
+      <w:r>
+        <w:rPr>
+          <w:rFonts w:ascii="Calibri" w:hAnsi="Calibri"/>
+          <w:sz w:val="24"/>
+        </w:rPr>
+        <w:t>Creates a one-way byte stream between processes.</w:t>
       </w:r>
     </w:p>
     <w:p>
       <w:pPr>
-        <w:spacing w:after="60" w:before="0"/>
+        <w:spacing w:after="40" w:before="0"/>
       </w:pPr>
       <w:r>
         <w:rPr>
           <w:rFonts w:ascii="Calibri" w:hAnsi="Calibri"/>
           <w:b/>
-          <w:sz w:val="25"/>
+          <w:sz w:val="24"/>
         </w:rPr>
-        <w:t xml:space="preserve">2) Process Creation with fork(): </w:t>
+        <w:t xml:space="preserve">2) </w:t>
       </w:r>
       <w:r>
         <w:rPr>
           <w:rFonts w:ascii="Calibri" w:hAnsi="Calibri"/>
-          <w:sz w:val="25"/>
+          <w:b/>
+          <w:sz w:val="24"/>
         </w:rPr>
-        <w:t>Calling fork() creates independent concurrent child processes sharing open file descriptors, enabling seamless inter-process communication.</w:t>
+        <w:t xml:space="preserve">fork(): </w:t>
+      </w:r>
+      <w:r>
+        <w:rPr>
+          <w:rFonts w:ascii="Calibri" w:hAnsi="Calibri"/>
+          <w:sz w:val="24"/>
+        </w:rPr>
+        <w:t>Creates child processes that inherit open pipe descriptors.</w:t>
       </w:r>
     </w:p>
     <w:p>
       <w:pPr>
-        <w:spacing w:after="60" w:before="0"/>
+        <w:spacing w:after="40" w:before="0"/>
       </w:pPr>
       <w:r>
         <w:rPr>
           <w:rFonts w:ascii="Calibri" w:hAnsi="Calibri"/>
           <w:b/>
-          <w:sz w:val="25"/>
+          <w:sz w:val="24"/>
         </w:rPr>
-        <w:t xml:space="preserve">3) Managing Pipe File Descriptors: </w:t>
+        <w:t xml:space="preserve">3) </w:t>
       </w:r>
       <w:r>
         <w:rPr>
           <w:rFonts w:ascii="Calibri" w:hAnsi="Calibri"/>
-          <w:sz w:val="25"/>
+          <w:b/>
+          <w:sz w:val="24"/>
         </w:rPr>
-        <w:t>Closing unused read and write ends in each process is mandatory to prevent hanging/deadlocks and ensure EOF is cleanly detected by read().</w:t>
+        <w:t xml:space="preserve">Closing pipes: </w:t>
+      </w:r>
+      <w:r>
+        <w:rPr>
+          <w:rFonts w:ascii="Calibri" w:hAnsi="Calibri"/>
+          <w:sz w:val="24"/>
+        </w:rPr>
+        <w:t>Closing unused ends prevents deadlocks and signals EOF.</w:t>
       </w:r>
     </w:p>
     <w:p>
       <w:pPr>
-        <w:spacing w:after="60" w:before="0"/>
+        <w:spacing w:after="40" w:before="0"/>
       </w:pPr>
       <w:r>
         <w:rPr>
           <w:rFonts w:ascii="Calibri" w:hAnsi="Calibri"/>
           <w:b/>
-          <w:sz w:val="25"/>
+          <w:sz w:val="24"/>
         </w:rPr>
-        <w:t xml:space="preserve">4) Three-Stage Circular Pipeline: </w:t>
+        <w:t xml:space="preserve">4) </w:t>
       </w:r>
       <w:r>
         <w:rPr>
           <w:rFonts w:ascii="Calibri" w:hAnsi="Calibri"/>
-          <w:sz w:val="25"/>
+          <w:b/>
+          <w:sz w:val="24"/>
         </w:rPr>
-        <w:t>Constructing a multi-stage pipeline where data undergoes sequential transformations across distinct processes before returning the final computation result to the parent.</w:t>
+        <w:t xml:space="preserve">IPC Chain: </w:t>
+      </w:r>
+      <w:r>
+        <w:rPr>
+          <w:rFonts w:ascii="Calibri" w:hAnsi="Calibri"/>
+          <w:sz w:val="24"/>
+        </w:rPr>
+        <w:t>Processes execute sequentially: P1 -&gt; P2 -&gt; P3 -&gt; P1.</w:t>
       </w:r>
     </w:p>
     <w:p>
       <w:pPr>
-        <w:spacing w:after="60" w:before="0"/>
+        <w:keepNext/>
+        <w:spacing w:before="80" w:after="80"/>
       </w:pPr>
       <w:r>
         <w:rPr>
           <w:rFonts w:ascii="Calibri" w:hAnsi="Calibri"/>
           <w:b/>
-          <w:sz w:val="25"/>
-        </w:rPr>
-        <w:t xml:space="preserve">5) String Formatting &amp; Punctuation Rules: </w:t>
-      </w:r>
-      <w:r>
-        <w:rPr>
-          <w:rFonts w:ascii="Calibri" w:hAnsi="Calibri"/>
-          <w:sz w:val="25"/>
-        </w:rPr>
-        <w:t>Implementing single-pass filtering to remove excessive whitespace, eliminate pre-punctuation spacing, enforce post-punctuation spacing, and apply word-level Title Case.</w:t>
-      </w:r>
-    </w:p>
-    <w:p>
-      <w:pPr>
-        <w:spacing w:after="60" w:before="0"/>
-      </w:pPr>
-      <w:r>
-        <w:rPr>
-          <w:rFonts w:ascii="Calibri" w:hAnsi="Calibri"/>
-          <w:b/>
-          <w:sz w:val="25"/>
-        </w:rPr>
-        <w:t xml:space="preserve">6) Synchronization with wait(): </w:t>
-      </w:r>
-      <w:r>
-        <w:rPr>
-          <w:rFonts w:ascii="Calibri" w:hAnsi="Calibri"/>
-          <w:sz w:val="25"/>
-        </w:rPr>
-        <w:t>Using wait(NULL) in the parent process to wait for children to terminate cleanly, avoiding zombie process generation.</w:t>
-      </w:r>
-    </w:p>
-    <w:p>
-      <w:pPr>
-        <w:keepNext/>
-        <w:spacing w:before="100" w:after="60"/>
-      </w:pPr>
-      <w:r>
-        <w:rPr>
-          <w:rFonts w:ascii="Calibri" w:hAnsi="Calibri"/>
-          <w:b/>
-          <w:sz w:val="25"/>
+          <w:sz w:val="24"/>
         </w:rPr>
         <w:t xml:space="preserve">Full Source Code (GitHub): </w:t>
       </w:r>
@@ -261,365 +255,225 @@
     <w:p>
       <w:pPr>
         <w:keepNext/>
-        <w:spacing w:before="100" w:after="40"/>
+        <w:spacing w:before="120" w:after="40"/>
       </w:pPr>
       <w:r>
         <w:rPr>
           <w:rFonts w:ascii="Calibri" w:hAnsi="Calibri"/>
           <w:b/>
-          <w:sz w:val="25"/>
+          <w:sz w:val="24"/>
         </w:rPr>
         <w:t>Code (main.c):</w:t>
       </w:r>
     </w:p>
-    <w:tbl>
-      <w:tblPr>
-        <w:tblW w:type="auto" w:w="0"/>
-        <w:jc w:val="left"/>
-        <w:tblLook w:firstColumn="1" w:firstRow="1" w:lastColumn="0" w:lastRow="0" w:noHBand="0" w:noVBand="1" w:val="04A0"/>
-      </w:tblPr>
-      <w:tblGrid>
-        <w:gridCol w:w="10224"/>
-      </w:tblGrid>
-      <w:tr>
-        <w:tc>
-          <w:tcPr>
-            <w:tcW w:type="dxa" w:w="10224"/>
-            <w:tcBorders>
-              <w:top w:val="single" w:sz="8" w:space="0" w:color="555555"/>
-              <w:left w:val="single" w:sz="8" w:space="0" w:color="555555"/>
-              <w:bottom w:val="single" w:sz="8" w:space="0" w:color="555555"/>
-              <w:right w:val="single" w:sz="8" w:space="0" w:color="555555"/>
-            </w:tcBorders>
-            <w:tcMar>
-              <w:top w:w="140" w:type="dxa"/>
-              <w:bottom w:w="140" w:type="dxa"/>
-              <w:left w:w="180" w:type="dxa"/>
-              <w:right w:w="180" w:type="dxa"/>
-            </w:tcMar>
-          </w:tcPr>
-          <w:p>
-            <w:pPr>
-              <w:spacing w:before="0" w:after="0" w:line="276" w:lineRule="auto"/>
-            </w:pPr>
-            <w:r>
-              <w:rPr>
-                <w:rFonts w:ascii="Consolas" w:hAnsi="Consolas"/>
-                <w:sz w:val="22"/>
-              </w:rPr>
-              <w:t>#include &lt;stdio.h&gt;</w:t>
-              <w:br/>
-              <w:t>#include &lt;stdlib.h&gt;</w:t>
-              <w:br/>
-              <w:t>#include &lt;unistd.h&gt;</w:t>
-              <w:br/>
-              <w:t>#include &lt;string.h&gt;</w:t>
-              <w:br/>
-              <w:t>#include &lt;ctype.h&gt;</w:t>
-              <w:br/>
-              <w:t>#include &lt;sys/wait.h&gt;</w:t>
-              <w:br/>
-              <w:br/>
-              <w:t>#define SIZE 5000</w:t>
-              <w:br/>
-              <w:br/>
-              <w:t>int main() {</w:t>
-              <w:br/>
-              <w:br/>
-              <w:t xml:space="preserve">    char filename[200];</w:t>
-              <w:br/>
-              <w:t xml:space="preserve">    char text[SIZE];</w:t>
-              <w:br/>
-              <w:br/>
-              <w:t xml:space="preserve">    printf("Enter file name: ");</w:t>
-              <w:br/>
-              <w:t xml:space="preserve">    fflush(stdout);</w:t>
-              <w:br/>
-              <w:t xml:space="preserve">    scanf("%s", filename);</w:t>
-              <w:br/>
-              <w:br/>
-              <w:t xml:space="preserve">    FILE *fp = fopen(filename, "r");</w:t>
-              <w:br/>
-              <w:t xml:space="preserve">    if(fp == NULL) {</w:t>
-              <w:br/>
-              <w:t xml:space="preserve">        printf("File cannot be opened\n");</w:t>
-              <w:br/>
-              <w:t xml:space="preserve">        return 1;</w:t>
-              <w:br/>
-              <w:t xml:space="preserve">    }</w:t>
-              <w:br/>
-              <w:br/>
-              <w:t xml:space="preserve">    int n = fread(text, 1, SIZE - 1, fp);</w:t>
-              <w:br/>
-              <w:t xml:space="preserve">    text[n] = '\0';</w:t>
-              <w:br/>
-              <w:t xml:space="preserve">    fclose(fp);</w:t>
-              <w:br/>
-              <w:br/>
-              <w:t xml:space="preserve">    int pipe1[2];</w:t>
-              <w:br/>
-              <w:t xml:space="preserve">    int pipe2[2];</w:t>
-              <w:br/>
-              <w:t xml:space="preserve">    int pipe3[2];</w:t>
-              <w:br/>
-              <w:br/>
-              <w:t xml:space="preserve">    pipe(pipe1);</w:t>
-              <w:br/>
-              <w:t xml:space="preserve">    pipe(pipe2);</w:t>
-              <w:br/>
-              <w:t xml:space="preserve">    pipe(pipe3);</w:t>
-              <w:br/>
-              <w:br/>
-              <w:t xml:space="preserve">    pid_t p2, p3;</w:t>
-              <w:br/>
-              <w:br/>
-              <w:t xml:space="preserve">    p2 = fork();</w:t>
-              <w:br/>
-              <w:br/>
-              <w:t xml:space="preserve">    if(p2 == 0) {</w:t>
-              <w:br/>
-              <w:br/>
-              <w:t xml:space="preserve">        // ---------------- PROCESS 2 (Text Formatter) ----------------</w:t>
-              <w:br/>
-              <w:br/>
-              <w:t xml:space="preserve">        char text[SIZE];</w:t>
-              <w:br/>
-              <w:t xml:space="preserve">        char formatted[SIZE];</w:t>
-              <w:br/>
-              <w:br/>
-              <w:t xml:space="preserve">        close(pipe1[1]);</w:t>
-              <w:br/>
-              <w:t xml:space="preserve">        close(pipe2[0]);</w:t>
-              <w:br/>
-              <w:t xml:space="preserve">        close(pipe3[0]);</w:t>
-              <w:br/>
-              <w:t xml:space="preserve">        close(pipe3[1]);</w:t>
-              <w:br/>
-              <w:br/>
-              <w:t xml:space="preserve">        int n = read(pipe1[0], text, SIZE - 1);</w:t>
-              <w:br/>
-              <w:t xml:space="preserve">        text[n] = '\0';</w:t>
-              <w:br/>
-              <w:br/>
-              <w:t xml:space="preserve">        int j = 0;</w:t>
-              <w:br/>
-              <w:t xml:space="preserve">        int space = 0;</w:t>
-              <w:br/>
-              <w:br/>
-              <w:t xml:space="preserve">        for(int i = 0; text[i] != '\0'; i++) {</w:t>
-              <w:br/>
-              <w:br/>
-              <w:t xml:space="preserve">            if(isspace(text[i])) {</w:t>
-              <w:br/>
-              <w:t xml:space="preserve">                space = 1;</w:t>
-              <w:br/>
-              <w:t xml:space="preserve">            }</w:t>
-              <w:br/>
-              <w:t xml:space="preserve">            else if(ispunct(text[i])) {</w:t>
-              <w:br/>
-              <w:br/>
-              <w:t xml:space="preserve">                // No blank space before punctuation marks</w:t>
-              <w:br/>
-              <w:t xml:space="preserve">                if(j &gt; 0 &amp;&amp; formatted[j - 1] == ' ') {</w:t>
-              <w:br/>
-              <w:t xml:space="preserve">                    j--;</w:t>
-              <w:br/>
-              <w:t xml:space="preserve">                }</w:t>
-              <w:br/>
-              <w:br/>
-              <w:t xml:space="preserve">                formatted[j++] = text[i];</w:t>
-              <w:br/>
-              <w:br/>
-              <w:t xml:space="preserve">                // Exactly one space after punctuation mark</w:t>
-              <w:br/>
-              <w:t xml:space="preserve">                if(text[i + 1] != '\0' &amp;&amp; !isspace(text[i + 1])) {</w:t>
-              <w:br/>
-              <w:t xml:space="preserve">                    formatted[j++] = ' ';</w:t>
-              <w:br/>
-              <w:t xml:space="preserve">                }</w:t>
-              <w:br/>
-              <w:br/>
-              <w:t xml:space="preserve">                space = 0;</w:t>
-              <w:br/>
-              <w:t xml:space="preserve">            }</w:t>
-              <w:br/>
-              <w:t xml:space="preserve">            else {</w:t>
-              <w:br/>
-              <w:br/>
-              <w:t xml:space="preserve">                // Only one blank space between two words</w:t>
-              <w:br/>
-              <w:t xml:space="preserve">                if(space &amp;&amp; j &gt; 0 &amp;&amp; formatted[j - 1] != ' ') {</w:t>
-              <w:br/>
-              <w:t xml:space="preserve">                    formatted[j++] = ' ';</w:t>
-              <w:br/>
-              <w:t xml:space="preserve">                }</w:t>
-              <w:br/>
-              <w:br/>
-              <w:t xml:space="preserve">                formatted[j++] = text[i];</w:t>
-              <w:br/>
-              <w:t xml:space="preserve">                space = 0;</w:t>
-              <w:br/>
-              <w:t xml:space="preserve">            }</w:t>
-              <w:br/>
-              <w:t xml:space="preserve">        }</w:t>
-              <w:br/>
-              <w:br/>
-              <w:t xml:space="preserve">        formatted[j] = '\0';</w:t>
-              <w:br/>
-              <w:br/>
-              <w:t xml:space="preserve">        write(pipe2[1], formatted, strlen(formatted) + 1);</w:t>
-              <w:br/>
-              <w:br/>
-              <w:t xml:space="preserve">        close(pipe1[0]);</w:t>
-              <w:br/>
-              <w:t xml:space="preserve">        close(pipe2[1]);</w:t>
-              <w:br/>
-              <w:br/>
-              <w:t xml:space="preserve">        exit(0);</w:t>
-              <w:br/>
-              <w:t xml:space="preserve">    }</w:t>
-              <w:br/>
-              <w:br/>
-              <w:t xml:space="preserve">    p3 = fork();</w:t>
-              <w:br/>
-              <w:br/>
-              <w:t xml:space="preserve">    if(p3 == 0) {</w:t>
-              <w:br/>
-              <w:br/>
-              <w:t xml:space="preserve">        // ---------------- PROCESS 3 (Case Converter &amp; Word Counter) ----------------</w:t>
-              <w:br/>
-              <w:br/>
-              <w:t xml:space="preserve">        char text[SIZE];</w:t>
-              <w:br/>
-              <w:br/>
-              <w:t xml:space="preserve">        close(pipe1[0]);</w:t>
-              <w:br/>
-              <w:t xml:space="preserve">        close(pipe1[1]);</w:t>
-              <w:br/>
-              <w:t xml:space="preserve">        close(pipe2[1]);</w:t>
-              <w:br/>
-              <w:t xml:space="preserve">        close(pipe3[0]);</w:t>
-              <w:br/>
-              <w:br/>
-              <w:t xml:space="preserve">        int n = read(pipe2[0], text, SIZE - 1);</w:t>
-              <w:br/>
-              <w:t xml:space="preserve">        text[n] = '\0';</w:t>
-              <w:br/>
-              <w:br/>
-              <w:t xml:space="preserve">        int word = 1;</w:t>
-              <w:br/>
-              <w:t xml:space="preserve">        int count = 0;</w:t>
-              <w:br/>
-              <w:br/>
-              <w:t xml:space="preserve">        for(int i = 0; text[i] != '\0'; i++) {</w:t>
-              <w:br/>
-              <w:br/>
-              <w:t xml:space="preserve">            if(isalpha(text[i])) {</w:t>
-              <w:br/>
-              <w:br/>
-              <w:t xml:space="preserve">                if(word) {</w:t>
-              <w:br/>
-              <w:t xml:space="preserve">                    text[i] = toupper(text[i]);</w:t>
-              <w:br/>
-              <w:t xml:space="preserve">                    count++;</w:t>
-              <w:br/>
-              <w:t xml:space="preserve">                    word = 0;</w:t>
-              <w:br/>
-              <w:t xml:space="preserve">                }</w:t>
-              <w:br/>
-              <w:t xml:space="preserve">                else {</w:t>
-              <w:br/>
-              <w:t xml:space="preserve">                    text[i] = tolower(text[i]);</w:t>
-              <w:br/>
-              <w:t xml:space="preserve">                }</w:t>
-              <w:br/>
-              <w:t xml:space="preserve">            }</w:t>
-              <w:br/>
-              <w:t xml:space="preserve">            else {</w:t>
-              <w:br/>
-              <w:t xml:space="preserve">                word = 1;</w:t>
-              <w:br/>
-              <w:t xml:space="preserve">            }</w:t>
-              <w:br/>
-              <w:t xml:space="preserve">        }</w:t>
-              <w:br/>
-              <w:br/>
-              <w:t xml:space="preserve">        printf("\nFinal Text:\n%s\n", text);</w:t>
-              <w:br/>
-              <w:t xml:space="preserve">        fflush(stdout);</w:t>
-              <w:br/>
-              <w:br/>
-              <w:t xml:space="preserve">        write(pipe3[1], &amp;count, sizeof(count));</w:t>
-              <w:br/>
-              <w:br/>
-              <w:t xml:space="preserve">        close(pipe2[0]);</w:t>
-              <w:br/>
-              <w:t xml:space="preserve">        close(pipe3[1]);</w:t>
-              <w:br/>
-              <w:br/>
-              <w:t xml:space="preserve">        exit(0);</w:t>
-              <w:br/>
-              <w:t xml:space="preserve">    }</w:t>
-              <w:br/>
-              <w:br/>
-              <w:t xml:space="preserve">    // ---------------- PROCESS 1 (File Reader) ----------------</w:t>
-              <w:br/>
-              <w:br/>
-              <w:t xml:space="preserve">    close(pipe1[0]);</w:t>
-              <w:br/>
-              <w:t xml:space="preserve">    close(pipe2[0]);</w:t>
-              <w:br/>
-              <w:t xml:space="preserve">    close(pipe2[1]);</w:t>
-              <w:br/>
-              <w:t xml:space="preserve">    close(pipe3[1]);</w:t>
-              <w:br/>
-              <w:br/>
-              <w:t xml:space="preserve">    write(pipe1[1], text, strlen(text) + 1);</w:t>
-              <w:br/>
-              <w:t xml:space="preserve">    close(pipe1[1]);</w:t>
-              <w:br/>
-              <w:br/>
-              <w:t xml:space="preserve">    int count;</w:t>
-              <w:br/>
-              <w:t xml:space="preserve">    read(pipe3[0], &amp;count, sizeof(count));</w:t>
-              <w:br/>
-              <w:t xml:space="preserve">    close(pipe3[0]);</w:t>
-              <w:br/>
-              <w:br/>
-              <w:t xml:space="preserve">    printf("\nTotal words = %d\n", count);</w:t>
-              <w:br/>
-              <w:br/>
-              <w:t xml:space="preserve">    wait(NULL);</w:t>
-              <w:br/>
-              <w:t xml:space="preserve">    wait(NULL);</w:t>
-              <w:br/>
-              <w:br/>
-              <w:t xml:space="preserve">    return 0;</w:t>
-              <w:br/>
-              <w:t>}</w:t>
-              <w:br/>
-            </w:r>
-          </w:p>
-        </w:tc>
-      </w:tr>
-    </w:tbl>
     <w:p>
       <w:pPr>
-        <w:spacing w:after="80"/>
+        <w:spacing w:before="40" w:after="120" w:line="252" w:lineRule="auto"/>
       </w:pPr>
+      <w:r>
+        <w:rPr>
+          <w:rFonts w:ascii="Consolas" w:hAnsi="Consolas"/>
+          <w:sz w:val="20"/>
+        </w:rPr>
+        <w:t>#include &lt;stdio.h&gt;</w:t>
+        <w:br/>
+        <w:t>#include &lt;stdlib.h&gt;</w:t>
+        <w:br/>
+        <w:t>#include &lt;unistd.h&gt;</w:t>
+        <w:br/>
+        <w:t>#include &lt;string.h&gt;</w:t>
+        <w:br/>
+        <w:t>#include &lt;ctype.h&gt;</w:t>
+        <w:br/>
+        <w:t>#include &lt;sys/wait.h&gt;</w:t>
+        <w:br/>
+        <w:br/>
+        <w:t>#define SIZE 2048</w:t>
+        <w:br/>
+        <w:br/>
+        <w:t>int main() {</w:t>
+        <w:br/>
+        <w:t xml:space="preserve">    char filename[100], text[SIZE];</w:t>
+        <w:br/>
+        <w:t xml:space="preserve">    printf("Enter file name: ");</w:t>
+        <w:br/>
+        <w:t xml:space="preserve">    scanf("%s", filename);</w:t>
+        <w:br/>
+        <w:br/>
+        <w:t xml:space="preserve">    FILE *fp = fopen(filename, "r");</w:t>
+        <w:br/>
+        <w:t xml:space="preserve">    if (!fp) {</w:t>
+        <w:br/>
+        <w:t xml:space="preserve">        printf("File cannot be opened\n");</w:t>
+        <w:br/>
+        <w:t xml:space="preserve">        return 1;</w:t>
+        <w:br/>
+        <w:t xml:space="preserve">    }</w:t>
+        <w:br/>
+        <w:t xml:space="preserve">    int n = fread(text, 1, SIZE - 1, fp);</w:t>
+        <w:br/>
+        <w:t xml:space="preserve">    text[n] = '\0';</w:t>
+        <w:br/>
+        <w:t xml:space="preserve">    fclose(fp);</w:t>
+        <w:br/>
+        <w:br/>
+        <w:t xml:space="preserve">    int p1[2], p2[2], p3[2];</w:t>
+        <w:br/>
+        <w:t xml:space="preserve">    pipe(p1); pipe(p2); pipe(p3);</w:t>
+        <w:br/>
+        <w:br/>
+        <w:t xml:space="preserve">    // Process 2: Text Formatter</w:t>
+        <w:br/>
+        <w:t xml:space="preserve">    if (fork() == 0) {</w:t>
+        <w:br/>
+        <w:t xml:space="preserve">        char in[SIZE], out[SIZE];</w:t>
+        <w:br/>
+        <w:t xml:space="preserve">        close(p1[1]); close(p2[0]); close(p3[0]); close(p3[1]);</w:t>
+        <w:br/>
+        <w:br/>
+        <w:t xml:space="preserve">        int len = read(p1[0], in, SIZE - 1);</w:t>
+        <w:br/>
+        <w:t xml:space="preserve">        in[len] = '\0';</w:t>
+        <w:br/>
+        <w:br/>
+        <w:t xml:space="preserve">        int j = 0, space = 0;</w:t>
+        <w:br/>
+        <w:t xml:space="preserve">        for (int i = 0; in[i]; i++) {</w:t>
+        <w:br/>
+        <w:t xml:space="preserve">            if (isspace(in[i])) {</w:t>
+        <w:br/>
+        <w:t xml:space="preserve">                space = 1;</w:t>
+        <w:br/>
+        <w:t xml:space="preserve">            } else if (ispunct(in[i])) {</w:t>
+        <w:br/>
+        <w:t xml:space="preserve">                if (j &gt; 0 &amp;&amp; out[j - 1] == ' ') j--; // No space before punctuation</w:t>
+        <w:br/>
+        <w:t xml:space="preserve">                out[j++] = in[i];</w:t>
+        <w:br/>
+        <w:t xml:space="preserve">                if (in[i + 1] &amp;&amp; !isspace(in[i + 1])) out[j++] = ' '; // One space after punctuation</w:t>
+        <w:br/>
+        <w:t xml:space="preserve">                space = 0;</w:t>
+        <w:br/>
+        <w:t xml:space="preserve">            } else {</w:t>
+        <w:br/>
+        <w:t xml:space="preserve">                if (space &amp;&amp; j &gt; 0 &amp;&amp; out[j - 1] != ' ') out[j++] = ' ';</w:t>
+        <w:br/>
+        <w:t xml:space="preserve">                out[j++] = in[i];</w:t>
+        <w:br/>
+        <w:t xml:space="preserve">                space = 0;</w:t>
+        <w:br/>
+        <w:t xml:space="preserve">            }</w:t>
+        <w:br/>
+        <w:t xml:space="preserve">        }</w:t>
+        <w:br/>
+        <w:t xml:space="preserve">        out[j] = '\0';</w:t>
+        <w:br/>
+        <w:br/>
+        <w:t xml:space="preserve">        write(p2[1], out, strlen(out) + 1);</w:t>
+        <w:br/>
+        <w:t xml:space="preserve">        close(p1[0]); close(p2[1]);</w:t>
+        <w:br/>
+        <w:t xml:space="preserve">        exit(0);</w:t>
+        <w:br/>
+        <w:t xml:space="preserve">    }</w:t>
+        <w:br/>
+        <w:br/>
+        <w:t xml:space="preserve">    // Process 3: Case Converter &amp; Word Counter</w:t>
+        <w:br/>
+        <w:t xml:space="preserve">    if (fork() == 0) {</w:t>
+        <w:br/>
+        <w:t xml:space="preserve">        char in[SIZE];</w:t>
+        <w:br/>
+        <w:t xml:space="preserve">        close(p1[0]); close(p1[1]); close(p2[1]); close(p3[0]);</w:t>
+        <w:br/>
+        <w:br/>
+        <w:t xml:space="preserve">        int len = read(p2[0], in, SIZE - 1);</w:t>
+        <w:br/>
+        <w:t xml:space="preserve">        in[len] = '\0';</w:t>
+        <w:br/>
+        <w:br/>
+        <w:t xml:space="preserve">        int word = 1, count = 0;</w:t>
+        <w:br/>
+        <w:t xml:space="preserve">        for (int i = 0; in[i]; i++) {</w:t>
+        <w:br/>
+        <w:t xml:space="preserve">            if (isalpha(in[i])) {</w:t>
+        <w:br/>
+        <w:t xml:space="preserve">                if (word) {</w:t>
+        <w:br/>
+        <w:t xml:space="preserve">                    in[i] = toupper(in[i]);</w:t>
+        <w:br/>
+        <w:t xml:space="preserve">                    count++;</w:t>
+        <w:br/>
+        <w:t xml:space="preserve">                    word = 0;</w:t>
+        <w:br/>
+        <w:t xml:space="preserve">                } else {</w:t>
+        <w:br/>
+        <w:t xml:space="preserve">                    in[i] = tolower(in[i]);</w:t>
+        <w:br/>
+        <w:t xml:space="preserve">                }</w:t>
+        <w:br/>
+        <w:t xml:space="preserve">            } else {</w:t>
+        <w:br/>
+        <w:t xml:space="preserve">                word = 1;</w:t>
+        <w:br/>
+        <w:t xml:space="preserve">            }</w:t>
+        <w:br/>
+        <w:t xml:space="preserve">        }</w:t>
+        <w:br/>
+        <w:br/>
+        <w:t xml:space="preserve">        printf("\nFinal Text:\n%s\n", in);</w:t>
+        <w:br/>
+        <w:t xml:space="preserve">        write(p3[1], &amp;count, sizeof(count));</w:t>
+        <w:br/>
+        <w:t xml:space="preserve">        close(p2[0]); close(p3[1]);</w:t>
+        <w:br/>
+        <w:t xml:space="preserve">        exit(0);</w:t>
+        <w:br/>
+        <w:t xml:space="preserve">    }</w:t>
+        <w:br/>
+        <w:br/>
+        <w:t xml:space="preserve">    // Process 1: File Reader &amp; Word Count Display</w:t>
+        <w:br/>
+        <w:t xml:space="preserve">    close(p1[0]); close(p2[0]); close(p2[1]); close(p3[1]);</w:t>
+        <w:br/>
+        <w:br/>
+        <w:t xml:space="preserve">    write(p1[1], text, strlen(text) + 1);</w:t>
+        <w:br/>
+        <w:t xml:space="preserve">    close(p1[1]);</w:t>
+        <w:br/>
+        <w:br/>
+        <w:t xml:space="preserve">    int count;</w:t>
+        <w:br/>
+        <w:t xml:space="preserve">    read(p3[0], &amp;count, sizeof(count));</w:t>
+        <w:br/>
+        <w:t xml:space="preserve">    close(p3[0]);</w:t>
+        <w:br/>
+        <w:br/>
+        <w:t xml:space="preserve">    printf("\nTotal words = %d\n", count);</w:t>
+        <w:br/>
+        <w:br/>
+        <w:t xml:space="preserve">    wait(NULL);</w:t>
+        <w:br/>
+        <w:t xml:space="preserve">    wait(NULL);</w:t>
+        <w:br/>
+        <w:t xml:space="preserve">    return 0;</w:t>
+        <w:br/>
+        <w:t>}</w:t>
+        <w:br/>
+      </w:r>
     </w:p>
     <w:p>
       <w:pPr>
         <w:keepNext/>
-        <w:spacing w:before="140" w:after="40"/>
+        <w:spacing w:before="160" w:after="40"/>
       </w:pPr>
       <w:r>
         <w:rPr>
           <w:rFonts w:ascii="Calibri" w:hAnsi="Calibri"/>
           <w:b/>
-          <w:sz w:val="25"/>
+          <w:sz w:val="24"/>
         </w:rPr>
-        <w:t>Output (Compilation &amp; Execution in Windows Terminal):</w:t>
+        <w:t>Output:</w:t>
       </w:r>
     </w:p>
     <w:p>
@@ -1039,7 +893,7 @@
     </w:pPr>
     <w:rPr>
       <w:rFonts w:ascii="Calibri" w:hAnsi="Calibri"/>
-      <w:sz w:val="25"/>
+      <w:sz w:val="24"/>
     </w:rPr>
   </w:style>
   <w:style w:type="paragraph" w:styleId="Header">

</xml_diff>